<commit_message>
docs: update AIPAF Framework document
</commit_message>
<xml_diff>
--- a/docs/sources/regulatory/AIPAF_Framework_v1_5.docx
+++ b/docs/sources/regulatory/AIPAF_Framework_v1_5.docx
@@ -95,7 +95,19 @@
         <w:rPr>
           <w:color w:val="7F8C8D"/>
         </w:rPr>
-        <w:t xml:space="preserve">Versione 1.2 — </w:t>
+        <w:t>Versione 1.</w:t>
+      </w:r>
+      <w:r>
+        <w:rPr>
+          <w:color w:val="7F8C8D"/>
+        </w:rPr>
+        <w:t>5</w:t>
+      </w:r>
+      <w:r>
+        <w:rPr>
+          <w:color w:val="7F8C8D"/>
+        </w:rPr>
+        <w:t xml:space="preserve"> — </w:t>
       </w:r>
       <w:proofErr w:type="gramStart"/>
       <w:r>
@@ -221,7 +233,7 @@
         </w:sectPr>
       </w:pPr>
     </w:p>
-    <w:bookmarkStart w:id="0" w:name="_Toc238499602" w:displacedByCustomXml="next"/>
+    <w:bookmarkStart w:id="0" w:name="_Toc238547671" w:displacedByCustomXml="next"/>
     <w:sdt>
       <w:sdtPr>
         <w:rPr>
@@ -256,6 +268,7 @@
             </w:tabs>
             <w:rPr>
               <w:rFonts w:eastAsiaTheme="minorEastAsia" w:cstheme="minorBidi"/>
+              <w:noProof/>
               <w:kern w:val="2"/>
               <w:sz w:val="24"/>
               <w:szCs w:val="24"/>
@@ -278,46 +291,58 @@
             </w:rPr>
             <w:fldChar w:fldCharType="separate"/>
           </w:r>
-          <w:hyperlink w:anchor="_Toc238499602">
-            <w:r>
-              <w:rPr>
-                <w:rStyle w:val="IndexLink"/>
-                <w:webHidden/>
+          <w:hyperlink w:anchor="_Toc238547671" w:history="1">
+            <w:r>
+              <w:rPr>
+                <w:rStyle w:val="Collegamentoipertestuale"/>
+                <w:noProof/>
               </w:rPr>
               <w:t>Sommario</w:t>
             </w:r>
             <w:r>
               <w:rPr>
+                <w:noProof/>
+                <w:webHidden/>
+              </w:rPr>
+              <w:tab/>
+            </w:r>
+            <w:r>
+              <w:rPr>
+                <w:noProof/>
                 <w:webHidden/>
               </w:rPr>
               <w:fldChar w:fldCharType="begin"/>
             </w:r>
             <w:r>
               <w:rPr>
-                <w:webHidden/>
-              </w:rPr>
-              <w:instrText>PAGEREF _Toc238499602 \h</w:instrText>
-            </w:r>
-            <w:r>
-              <w:rPr>
-                <w:webHidden/>
-              </w:rPr>
-            </w:r>
-            <w:r>
-              <w:rPr>
+                <w:noProof/>
+                <w:webHidden/>
+              </w:rPr>
+              <w:instrText xml:space="preserve"> PAGEREF _Toc238547671 \h </w:instrText>
+            </w:r>
+            <w:r>
+              <w:rPr>
+                <w:noProof/>
+                <w:webHidden/>
+              </w:rPr>
+            </w:r>
+            <w:r>
+              <w:rPr>
+                <w:noProof/>
                 <w:webHidden/>
               </w:rPr>
               <w:fldChar w:fldCharType="separate"/>
             </w:r>
             <w:r>
               <w:rPr>
-                <w:rStyle w:val="IndexLink"/>
-              </w:rPr>
-              <w:tab/>
+                <w:noProof/>
+                <w:webHidden/>
+              </w:rPr>
               <w:t>2</w:t>
             </w:r>
             <w:r>
               <w:rPr>
+                <w:noProof/>
                 <w:webHidden/>
               </w:rPr>
               <w:fldChar w:fldCharType="end"/>
@@ -332,52 +357,65 @@
             </w:tabs>
             <w:rPr>
               <w:rFonts w:eastAsiaTheme="minorEastAsia" w:cstheme="minorBidi"/>
+              <w:noProof/>
               <w:kern w:val="2"/>
               <w:sz w:val="24"/>
               <w:szCs w:val="24"/>
               <w14:ligatures w14:val="standardContextual"/>
             </w:rPr>
           </w:pPr>
-          <w:hyperlink w:anchor="_Toc238499603">
-            <w:r>
-              <w:rPr>
-                <w:rStyle w:val="IndexLink"/>
-                <w:webHidden/>
+          <w:hyperlink w:anchor="_Toc238547672" w:history="1">
+            <w:r>
+              <w:rPr>
+                <w:rStyle w:val="Collegamentoipertestuale"/>
+                <w:noProof/>
               </w:rPr>
               <w:t>1. Executive Summary</w:t>
             </w:r>
             <w:r>
               <w:rPr>
+                <w:noProof/>
+                <w:webHidden/>
+              </w:rPr>
+              <w:tab/>
+            </w:r>
+            <w:r>
+              <w:rPr>
+                <w:noProof/>
                 <w:webHidden/>
               </w:rPr>
               <w:fldChar w:fldCharType="begin"/>
             </w:r>
             <w:r>
               <w:rPr>
-                <w:webHidden/>
-              </w:rPr>
-              <w:instrText>PAGEREF _Toc238499603 \h</w:instrText>
-            </w:r>
-            <w:r>
-              <w:rPr>
-                <w:webHidden/>
-              </w:rPr>
-            </w:r>
-            <w:r>
-              <w:rPr>
+                <w:noProof/>
+                <w:webHidden/>
+              </w:rPr>
+              <w:instrText xml:space="preserve"> PAGEREF _Toc238547672 \h </w:instrText>
+            </w:r>
+            <w:r>
+              <w:rPr>
+                <w:noProof/>
+                <w:webHidden/>
+              </w:rPr>
+            </w:r>
+            <w:r>
+              <w:rPr>
+                <w:noProof/>
                 <w:webHidden/>
               </w:rPr>
               <w:fldChar w:fldCharType="separate"/>
             </w:r>
             <w:r>
               <w:rPr>
-                <w:rStyle w:val="IndexLink"/>
-              </w:rPr>
-              <w:tab/>
-              <w:t>4</w:t>
-            </w:r>
-            <w:r>
-              <w:rPr>
+                <w:noProof/>
+                <w:webHidden/>
+              </w:rPr>
+              <w:t>3</w:t>
+            </w:r>
+            <w:r>
+              <w:rPr>
+                <w:noProof/>
                 <w:webHidden/>
               </w:rPr>
               <w:fldChar w:fldCharType="end"/>
@@ -392,52 +430,65 @@
             </w:tabs>
             <w:rPr>
               <w:rFonts w:eastAsiaTheme="minorEastAsia" w:cstheme="minorBidi"/>
+              <w:noProof/>
               <w:kern w:val="2"/>
               <w:sz w:val="24"/>
               <w:szCs w:val="24"/>
               <w14:ligatures w14:val="standardContextual"/>
             </w:rPr>
           </w:pPr>
-          <w:hyperlink w:anchor="_Toc238499604">
-            <w:r>
-              <w:rPr>
-                <w:rStyle w:val="IndexLink"/>
-                <w:webHidden/>
+          <w:hyperlink w:anchor="_Toc238547673" w:history="1">
+            <w:r>
+              <w:rPr>
+                <w:rStyle w:val="Collegamentoipertestuale"/>
+                <w:noProof/>
               </w:rPr>
               <w:t>2. Contesto e Motivazione</w:t>
             </w:r>
             <w:r>
               <w:rPr>
+                <w:noProof/>
+                <w:webHidden/>
+              </w:rPr>
+              <w:tab/>
+            </w:r>
+            <w:r>
+              <w:rPr>
+                <w:noProof/>
                 <w:webHidden/>
               </w:rPr>
               <w:fldChar w:fldCharType="begin"/>
             </w:r>
             <w:r>
               <w:rPr>
-                <w:webHidden/>
-              </w:rPr>
-              <w:instrText>PAGEREF _Toc238499604 \h</w:instrText>
-            </w:r>
-            <w:r>
-              <w:rPr>
-                <w:webHidden/>
-              </w:rPr>
-            </w:r>
-            <w:r>
-              <w:rPr>
+                <w:noProof/>
+                <w:webHidden/>
+              </w:rPr>
+              <w:instrText xml:space="preserve"> PAGEREF _Toc238547673 \h </w:instrText>
+            </w:r>
+            <w:r>
+              <w:rPr>
+                <w:noProof/>
+                <w:webHidden/>
+              </w:rPr>
+            </w:r>
+            <w:r>
+              <w:rPr>
+                <w:noProof/>
                 <w:webHidden/>
               </w:rPr>
               <w:fldChar w:fldCharType="separate"/>
             </w:r>
             <w:r>
               <w:rPr>
-                <w:rStyle w:val="IndexLink"/>
-              </w:rPr>
-              <w:tab/>
-              <w:t>5</w:t>
-            </w:r>
-            <w:r>
-              <w:rPr>
+                <w:noProof/>
+                <w:webHidden/>
+              </w:rPr>
+              <w:t>4</w:t>
+            </w:r>
+            <w:r>
+              <w:rPr>
+                <w:noProof/>
                 <w:webHidden/>
               </w:rPr>
               <w:fldChar w:fldCharType="end"/>
@@ -452,52 +503,65 @@
             </w:tabs>
             <w:rPr>
               <w:rFonts w:eastAsiaTheme="minorEastAsia" w:cstheme="minorBidi"/>
+              <w:noProof/>
               <w:kern w:val="2"/>
               <w:sz w:val="24"/>
               <w:szCs w:val="24"/>
               <w14:ligatures w14:val="standardContextual"/>
             </w:rPr>
           </w:pPr>
-          <w:hyperlink w:anchor="_Toc238499605">
-            <w:r>
-              <w:rPr>
-                <w:rStyle w:val="IndexLink"/>
-                <w:webHidden/>
+          <w:hyperlink w:anchor="_Toc238547674" w:history="1">
+            <w:r>
+              <w:rPr>
+                <w:rStyle w:val="Collegamentoipertestuale"/>
+                <w:noProof/>
               </w:rPr>
               <w:t>2.1 Framework di Riferimento</w:t>
             </w:r>
             <w:r>
               <w:rPr>
+                <w:noProof/>
+                <w:webHidden/>
+              </w:rPr>
+              <w:tab/>
+            </w:r>
+            <w:r>
+              <w:rPr>
+                <w:noProof/>
                 <w:webHidden/>
               </w:rPr>
               <w:fldChar w:fldCharType="begin"/>
             </w:r>
             <w:r>
               <w:rPr>
-                <w:webHidden/>
-              </w:rPr>
-              <w:instrText>PAGEREF _Toc238499605 \h</w:instrText>
-            </w:r>
-            <w:r>
-              <w:rPr>
-                <w:webHidden/>
-              </w:rPr>
-            </w:r>
-            <w:r>
-              <w:rPr>
+                <w:noProof/>
+                <w:webHidden/>
+              </w:rPr>
+              <w:instrText xml:space="preserve"> PAGEREF _Toc238547674 \h </w:instrText>
+            </w:r>
+            <w:r>
+              <w:rPr>
+                <w:noProof/>
+                <w:webHidden/>
+              </w:rPr>
+            </w:r>
+            <w:r>
+              <w:rPr>
+                <w:noProof/>
                 <w:webHidden/>
               </w:rPr>
               <w:fldChar w:fldCharType="separate"/>
             </w:r>
             <w:r>
               <w:rPr>
-                <w:rStyle w:val="IndexLink"/>
-              </w:rPr>
-              <w:tab/>
-              <w:t>7</w:t>
-            </w:r>
-            <w:r>
-              <w:rPr>
+                <w:noProof/>
+                <w:webHidden/>
+              </w:rPr>
+              <w:t>6</w:t>
+            </w:r>
+            <w:r>
+              <w:rPr>
+                <w:noProof/>
                 <w:webHidden/>
               </w:rPr>
               <w:fldChar w:fldCharType="end"/>
@@ -512,52 +576,65 @@
             </w:tabs>
             <w:rPr>
               <w:rFonts w:eastAsiaTheme="minorEastAsia" w:cstheme="minorBidi"/>
+              <w:noProof/>
               <w:kern w:val="2"/>
               <w:sz w:val="24"/>
               <w:szCs w:val="24"/>
               <w14:ligatures w14:val="standardContextual"/>
             </w:rPr>
           </w:pPr>
-          <w:hyperlink w:anchor="_Toc238499606">
-            <w:r>
-              <w:rPr>
-                <w:rStyle w:val="IndexLink"/>
-                <w:webHidden/>
+          <w:hyperlink w:anchor="_Toc238547675" w:history="1">
+            <w:r>
+              <w:rPr>
+                <w:rStyle w:val="Collegamentoipertestuale"/>
+                <w:noProof/>
               </w:rPr>
               <w:t>2.2 Lezioni dai fallimenti: perché serve AIPAF</w:t>
             </w:r>
             <w:r>
               <w:rPr>
+                <w:noProof/>
+                <w:webHidden/>
+              </w:rPr>
+              <w:tab/>
+            </w:r>
+            <w:r>
+              <w:rPr>
+                <w:noProof/>
                 <w:webHidden/>
               </w:rPr>
               <w:fldChar w:fldCharType="begin"/>
             </w:r>
             <w:r>
               <w:rPr>
-                <w:webHidden/>
-              </w:rPr>
-              <w:instrText>PAGEREF _Toc238499606 \h</w:instrText>
-            </w:r>
-            <w:r>
-              <w:rPr>
-                <w:webHidden/>
-              </w:rPr>
-            </w:r>
-            <w:r>
-              <w:rPr>
+                <w:noProof/>
+                <w:webHidden/>
+              </w:rPr>
+              <w:instrText xml:space="preserve"> PAGEREF _Toc238547675 \h </w:instrText>
+            </w:r>
+            <w:r>
+              <w:rPr>
+                <w:noProof/>
+                <w:webHidden/>
+              </w:rPr>
+            </w:r>
+            <w:r>
+              <w:rPr>
+                <w:noProof/>
                 <w:webHidden/>
               </w:rPr>
               <w:fldChar w:fldCharType="separate"/>
             </w:r>
             <w:r>
               <w:rPr>
-                <w:rStyle w:val="IndexLink"/>
-              </w:rPr>
-              <w:tab/>
-              <w:t>7</w:t>
-            </w:r>
-            <w:r>
-              <w:rPr>
+                <w:noProof/>
+                <w:webHidden/>
+              </w:rPr>
+              <w:t>6</w:t>
+            </w:r>
+            <w:r>
+              <w:rPr>
+                <w:noProof/>
                 <w:webHidden/>
               </w:rPr>
               <w:fldChar w:fldCharType="end"/>
@@ -572,52 +649,65 @@
             </w:tabs>
             <w:rPr>
               <w:rFonts w:eastAsiaTheme="minorEastAsia" w:cstheme="minorBidi"/>
+              <w:noProof/>
               <w:kern w:val="2"/>
               <w:sz w:val="24"/>
               <w:szCs w:val="24"/>
               <w14:ligatures w14:val="standardContextual"/>
             </w:rPr>
           </w:pPr>
-          <w:hyperlink w:anchor="_Toc238499607">
-            <w:r>
-              <w:rPr>
-                <w:rStyle w:val="IndexLink"/>
-                <w:webHidden/>
+          <w:hyperlink w:anchor="_Toc238547676" w:history="1">
+            <w:r>
+              <w:rPr>
+                <w:rStyle w:val="Collegamentoipertestuale"/>
+                <w:noProof/>
               </w:rPr>
               <w:t>3. Struttura del Framework</w:t>
             </w:r>
             <w:r>
               <w:rPr>
+                <w:noProof/>
+                <w:webHidden/>
+              </w:rPr>
+              <w:tab/>
+            </w:r>
+            <w:r>
+              <w:rPr>
+                <w:noProof/>
                 <w:webHidden/>
               </w:rPr>
               <w:fldChar w:fldCharType="begin"/>
             </w:r>
             <w:r>
               <w:rPr>
-                <w:webHidden/>
-              </w:rPr>
-              <w:instrText>PAGEREF _Toc238499607 \h</w:instrText>
-            </w:r>
-            <w:r>
-              <w:rPr>
-                <w:webHidden/>
-              </w:rPr>
-            </w:r>
-            <w:r>
-              <w:rPr>
+                <w:noProof/>
+                <w:webHidden/>
+              </w:rPr>
+              <w:instrText xml:space="preserve"> PAGEREF _Toc238547676 \h </w:instrText>
+            </w:r>
+            <w:r>
+              <w:rPr>
+                <w:noProof/>
+                <w:webHidden/>
+              </w:rPr>
+            </w:r>
+            <w:r>
+              <w:rPr>
+                <w:noProof/>
                 <w:webHidden/>
               </w:rPr>
               <w:fldChar w:fldCharType="separate"/>
             </w:r>
             <w:r>
               <w:rPr>
-                <w:rStyle w:val="IndexLink"/>
-              </w:rPr>
-              <w:tab/>
-              <w:t>9</w:t>
-            </w:r>
-            <w:r>
-              <w:rPr>
+                <w:noProof/>
+                <w:webHidden/>
+              </w:rPr>
+              <w:t>8</w:t>
+            </w:r>
+            <w:r>
+              <w:rPr>
+                <w:noProof/>
                 <w:webHidden/>
               </w:rPr>
               <w:fldChar w:fldCharType="end"/>
@@ -632,52 +722,65 @@
             </w:tabs>
             <w:rPr>
               <w:rFonts w:eastAsiaTheme="minorEastAsia" w:cstheme="minorBidi"/>
+              <w:noProof/>
               <w:kern w:val="2"/>
               <w:sz w:val="24"/>
               <w:szCs w:val="24"/>
               <w14:ligatures w14:val="standardContextual"/>
             </w:rPr>
           </w:pPr>
-          <w:hyperlink w:anchor="_Toc238499608">
-            <w:r>
-              <w:rPr>
-                <w:rStyle w:val="IndexLink"/>
-                <w:webHidden/>
+          <w:hyperlink w:anchor="_Toc238547677" w:history="1">
+            <w:r>
+              <w:rPr>
+                <w:rStyle w:val="Collegamentoipertestuale"/>
+                <w:noProof/>
               </w:rPr>
               <w:t>4. Dettaglio delle Dimensioni</w:t>
             </w:r>
             <w:r>
               <w:rPr>
+                <w:noProof/>
+                <w:webHidden/>
+              </w:rPr>
+              <w:tab/>
+            </w:r>
+            <w:r>
+              <w:rPr>
+                <w:noProof/>
                 <w:webHidden/>
               </w:rPr>
               <w:fldChar w:fldCharType="begin"/>
             </w:r>
             <w:r>
               <w:rPr>
-                <w:webHidden/>
-              </w:rPr>
-              <w:instrText>PAGEREF _Toc238499608 \h</w:instrText>
-            </w:r>
-            <w:r>
-              <w:rPr>
-                <w:webHidden/>
-              </w:rPr>
-            </w:r>
-            <w:r>
-              <w:rPr>
+                <w:noProof/>
+                <w:webHidden/>
+              </w:rPr>
+              <w:instrText xml:space="preserve"> PAGEREF _Toc238547677 \h </w:instrText>
+            </w:r>
+            <w:r>
+              <w:rPr>
+                <w:noProof/>
+                <w:webHidden/>
+              </w:rPr>
+            </w:r>
+            <w:r>
+              <w:rPr>
+                <w:noProof/>
                 <w:webHidden/>
               </w:rPr>
               <w:fldChar w:fldCharType="separate"/>
             </w:r>
             <w:r>
               <w:rPr>
-                <w:rStyle w:val="IndexLink"/>
-              </w:rPr>
-              <w:tab/>
-              <w:t>10</w:t>
-            </w:r>
-            <w:r>
-              <w:rPr>
+                <w:noProof/>
+                <w:webHidden/>
+              </w:rPr>
+              <w:t>9</w:t>
+            </w:r>
+            <w:r>
+              <w:rPr>
+                <w:noProof/>
                 <w:webHidden/>
               </w:rPr>
               <w:fldChar w:fldCharType="end"/>
@@ -692,52 +795,65 @@
             </w:tabs>
             <w:rPr>
               <w:rFonts w:eastAsiaTheme="minorEastAsia" w:cstheme="minorBidi"/>
+              <w:noProof/>
               <w:kern w:val="2"/>
               <w:sz w:val="24"/>
               <w:szCs w:val="24"/>
               <w14:ligatures w14:val="standardContextual"/>
             </w:rPr>
           </w:pPr>
-          <w:hyperlink w:anchor="_Toc238499609">
-            <w:r>
-              <w:rPr>
-                <w:rStyle w:val="IndexLink"/>
-                <w:webHidden/>
+          <w:hyperlink w:anchor="_Toc238547678" w:history="1">
+            <w:r>
+              <w:rPr>
+                <w:rStyle w:val="Collegamentoipertestuale"/>
+                <w:noProof/>
               </w:rPr>
               <w:t>Nota sulla governance trasversale</w:t>
             </w:r>
             <w:r>
               <w:rPr>
+                <w:noProof/>
+                <w:webHidden/>
+              </w:rPr>
+              <w:tab/>
+            </w:r>
+            <w:r>
+              <w:rPr>
+                <w:noProof/>
                 <w:webHidden/>
               </w:rPr>
               <w:fldChar w:fldCharType="begin"/>
             </w:r>
             <w:r>
               <w:rPr>
-                <w:webHidden/>
-              </w:rPr>
-              <w:instrText>PAGEREF _Toc238499609 \h</w:instrText>
-            </w:r>
-            <w:r>
-              <w:rPr>
-                <w:webHidden/>
-              </w:rPr>
-            </w:r>
-            <w:r>
-              <w:rPr>
+                <w:noProof/>
+                <w:webHidden/>
+              </w:rPr>
+              <w:instrText xml:space="preserve"> PAGEREF _Toc238547678 \h </w:instrText>
+            </w:r>
+            <w:r>
+              <w:rPr>
+                <w:noProof/>
+                <w:webHidden/>
+              </w:rPr>
+            </w:r>
+            <w:r>
+              <w:rPr>
+                <w:noProof/>
                 <w:webHidden/>
               </w:rPr>
               <w:fldChar w:fldCharType="separate"/>
             </w:r>
             <w:r>
               <w:rPr>
-                <w:rStyle w:val="IndexLink"/>
-              </w:rPr>
-              <w:tab/>
-              <w:t>10</w:t>
-            </w:r>
-            <w:r>
-              <w:rPr>
+                <w:noProof/>
+                <w:webHidden/>
+              </w:rPr>
+              <w:t>9</w:t>
+            </w:r>
+            <w:r>
+              <w:rPr>
+                <w:noProof/>
                 <w:webHidden/>
               </w:rPr>
               <w:fldChar w:fldCharType="end"/>
@@ -752,52 +868,65 @@
             </w:tabs>
             <w:rPr>
               <w:rFonts w:eastAsiaTheme="minorEastAsia" w:cstheme="minorBidi"/>
+              <w:noProof/>
               <w:kern w:val="2"/>
               <w:sz w:val="24"/>
               <w:szCs w:val="24"/>
               <w14:ligatures w14:val="standardContextual"/>
             </w:rPr>
           </w:pPr>
-          <w:hyperlink w:anchor="_Toc238499610">
-            <w:r>
-              <w:rPr>
-                <w:rStyle w:val="IndexLink"/>
-                <w:webHidden/>
+          <w:hyperlink w:anchor="_Toc238547679" w:history="1">
+            <w:r>
+              <w:rPr>
+                <w:rStyle w:val="Collegamentoipertestuale"/>
+                <w:noProof/>
               </w:rPr>
               <w:t>D1. Strategic Alignment &amp; Business Value</w:t>
             </w:r>
             <w:r>
               <w:rPr>
+                <w:noProof/>
+                <w:webHidden/>
+              </w:rPr>
+              <w:tab/>
+            </w:r>
+            <w:r>
+              <w:rPr>
+                <w:noProof/>
                 <w:webHidden/>
               </w:rPr>
               <w:fldChar w:fldCharType="begin"/>
             </w:r>
             <w:r>
               <w:rPr>
-                <w:webHidden/>
-              </w:rPr>
-              <w:instrText>PAGEREF _Toc238499610 \h</w:instrText>
-            </w:r>
-            <w:r>
-              <w:rPr>
-                <w:webHidden/>
-              </w:rPr>
-            </w:r>
-            <w:r>
-              <w:rPr>
+                <w:noProof/>
+                <w:webHidden/>
+              </w:rPr>
+              <w:instrText xml:space="preserve"> PAGEREF _Toc238547679 \h </w:instrText>
+            </w:r>
+            <w:r>
+              <w:rPr>
+                <w:noProof/>
+                <w:webHidden/>
+              </w:rPr>
+            </w:r>
+            <w:r>
+              <w:rPr>
+                <w:noProof/>
                 <w:webHidden/>
               </w:rPr>
               <w:fldChar w:fldCharType="separate"/>
             </w:r>
             <w:r>
               <w:rPr>
-                <w:rStyle w:val="IndexLink"/>
-              </w:rPr>
-              <w:tab/>
-              <w:t>10</w:t>
-            </w:r>
-            <w:r>
-              <w:rPr>
+                <w:noProof/>
+                <w:webHidden/>
+              </w:rPr>
+              <w:t>9</w:t>
+            </w:r>
+            <w:r>
+              <w:rPr>
+                <w:noProof/>
                 <w:webHidden/>
               </w:rPr>
               <w:fldChar w:fldCharType="end"/>
@@ -812,52 +941,65 @@
             </w:tabs>
             <w:rPr>
               <w:rFonts w:eastAsiaTheme="minorEastAsia" w:cstheme="minorBidi"/>
+              <w:noProof/>
               <w:kern w:val="2"/>
               <w:sz w:val="24"/>
               <w:szCs w:val="24"/>
               <w14:ligatures w14:val="standardContextual"/>
             </w:rPr>
           </w:pPr>
-          <w:hyperlink w:anchor="_Toc238499611">
-            <w:r>
-              <w:rPr>
-                <w:rStyle w:val="IndexLink"/>
-                <w:webHidden/>
+          <w:hyperlink w:anchor="_Toc238547680" w:history="1">
+            <w:r>
+              <w:rPr>
+                <w:rStyle w:val="Collegamentoipertestuale"/>
+                <w:noProof/>
               </w:rPr>
               <w:t>D2. Risk Classification &amp; Regulatory Compliance</w:t>
             </w:r>
             <w:r>
               <w:rPr>
+                <w:noProof/>
+                <w:webHidden/>
+              </w:rPr>
+              <w:tab/>
+            </w:r>
+            <w:r>
+              <w:rPr>
+                <w:noProof/>
                 <w:webHidden/>
               </w:rPr>
               <w:fldChar w:fldCharType="begin"/>
             </w:r>
             <w:r>
               <w:rPr>
-                <w:webHidden/>
-              </w:rPr>
-              <w:instrText>PAGEREF _Toc238499611 \h</w:instrText>
-            </w:r>
-            <w:r>
-              <w:rPr>
-                <w:webHidden/>
-              </w:rPr>
-            </w:r>
-            <w:r>
-              <w:rPr>
+                <w:noProof/>
+                <w:webHidden/>
+              </w:rPr>
+              <w:instrText xml:space="preserve"> PAGEREF _Toc238547680 \h </w:instrText>
+            </w:r>
+            <w:r>
+              <w:rPr>
+                <w:noProof/>
+                <w:webHidden/>
+              </w:rPr>
+            </w:r>
+            <w:r>
+              <w:rPr>
+                <w:noProof/>
                 <w:webHidden/>
               </w:rPr>
               <w:fldChar w:fldCharType="separate"/>
             </w:r>
             <w:r>
               <w:rPr>
-                <w:rStyle w:val="IndexLink"/>
-              </w:rPr>
-              <w:tab/>
-              <w:t>11</w:t>
-            </w:r>
-            <w:r>
-              <w:rPr>
+                <w:noProof/>
+                <w:webHidden/>
+              </w:rPr>
+              <w:t>10</w:t>
+            </w:r>
+            <w:r>
+              <w:rPr>
+                <w:noProof/>
                 <w:webHidden/>
               </w:rPr>
               <w:fldChar w:fldCharType="end"/>
@@ -872,52 +1014,65 @@
             </w:tabs>
             <w:rPr>
               <w:rFonts w:eastAsiaTheme="minorEastAsia" w:cstheme="minorBidi"/>
+              <w:noProof/>
               <w:kern w:val="2"/>
               <w:sz w:val="24"/>
               <w:szCs w:val="24"/>
               <w14:ligatures w14:val="standardContextual"/>
             </w:rPr>
           </w:pPr>
-          <w:hyperlink w:anchor="_Toc238499612">
-            <w:r>
-              <w:rPr>
-                <w:rStyle w:val="IndexLink"/>
-                <w:webHidden/>
+          <w:hyperlink w:anchor="_Toc238547681" w:history="1">
+            <w:r>
+              <w:rPr>
+                <w:rStyle w:val="Collegamentoipertestuale"/>
+                <w:noProof/>
               </w:rPr>
               <w:t>D3. Data Readiness &amp; Governance</w:t>
             </w:r>
             <w:r>
               <w:rPr>
+                <w:noProof/>
+                <w:webHidden/>
+              </w:rPr>
+              <w:tab/>
+            </w:r>
+            <w:r>
+              <w:rPr>
+                <w:noProof/>
                 <w:webHidden/>
               </w:rPr>
               <w:fldChar w:fldCharType="begin"/>
             </w:r>
             <w:r>
               <w:rPr>
-                <w:webHidden/>
-              </w:rPr>
-              <w:instrText>PAGEREF _Toc238499612 \h</w:instrText>
-            </w:r>
-            <w:r>
-              <w:rPr>
-                <w:webHidden/>
-              </w:rPr>
-            </w:r>
-            <w:r>
-              <w:rPr>
+                <w:noProof/>
+                <w:webHidden/>
+              </w:rPr>
+              <w:instrText xml:space="preserve"> PAGEREF _Toc238547681 \h </w:instrText>
+            </w:r>
+            <w:r>
+              <w:rPr>
+                <w:noProof/>
+                <w:webHidden/>
+              </w:rPr>
+            </w:r>
+            <w:r>
+              <w:rPr>
+                <w:noProof/>
                 <w:webHidden/>
               </w:rPr>
               <w:fldChar w:fldCharType="separate"/>
             </w:r>
             <w:r>
               <w:rPr>
-                <w:rStyle w:val="IndexLink"/>
-              </w:rPr>
-              <w:tab/>
-              <w:t>11</w:t>
-            </w:r>
-            <w:r>
-              <w:rPr>
+                <w:noProof/>
+                <w:webHidden/>
+              </w:rPr>
+              <w:t>10</w:t>
+            </w:r>
+            <w:r>
+              <w:rPr>
+                <w:noProof/>
                 <w:webHidden/>
               </w:rPr>
               <w:fldChar w:fldCharType="end"/>
@@ -932,52 +1087,65 @@
             </w:tabs>
             <w:rPr>
               <w:rFonts w:eastAsiaTheme="minorEastAsia" w:cstheme="minorBidi"/>
+              <w:noProof/>
               <w:kern w:val="2"/>
               <w:sz w:val="24"/>
               <w:szCs w:val="24"/>
               <w14:ligatures w14:val="standardContextual"/>
             </w:rPr>
           </w:pPr>
-          <w:hyperlink w:anchor="_Toc238499613">
-            <w:r>
-              <w:rPr>
-                <w:rStyle w:val="IndexLink"/>
-                <w:webHidden/>
+          <w:hyperlink w:anchor="_Toc238547682" w:history="1">
+            <w:r>
+              <w:rPr>
+                <w:rStyle w:val="Collegamentoipertestuale"/>
+                <w:noProof/>
               </w:rPr>
               <w:t>D4. Technical Feasibility &amp; Architecture</w:t>
             </w:r>
             <w:r>
               <w:rPr>
+                <w:noProof/>
+                <w:webHidden/>
+              </w:rPr>
+              <w:tab/>
+            </w:r>
+            <w:r>
+              <w:rPr>
+                <w:noProof/>
                 <w:webHidden/>
               </w:rPr>
               <w:fldChar w:fldCharType="begin"/>
             </w:r>
             <w:r>
               <w:rPr>
-                <w:webHidden/>
-              </w:rPr>
-              <w:instrText>PAGEREF _Toc238499613 \h</w:instrText>
-            </w:r>
-            <w:r>
-              <w:rPr>
-                <w:webHidden/>
-              </w:rPr>
-            </w:r>
-            <w:r>
-              <w:rPr>
+                <w:noProof/>
+                <w:webHidden/>
+              </w:rPr>
+              <w:instrText xml:space="preserve"> PAGEREF _Toc238547682 \h </w:instrText>
+            </w:r>
+            <w:r>
+              <w:rPr>
+                <w:noProof/>
+                <w:webHidden/>
+              </w:rPr>
+            </w:r>
+            <w:r>
+              <w:rPr>
+                <w:noProof/>
                 <w:webHidden/>
               </w:rPr>
               <w:fldChar w:fldCharType="separate"/>
             </w:r>
             <w:r>
               <w:rPr>
-                <w:rStyle w:val="IndexLink"/>
-              </w:rPr>
-              <w:tab/>
-              <w:t>12</w:t>
-            </w:r>
-            <w:r>
-              <w:rPr>
+                <w:noProof/>
+                <w:webHidden/>
+              </w:rPr>
+              <w:t>11</w:t>
+            </w:r>
+            <w:r>
+              <w:rPr>
+                <w:noProof/>
                 <w:webHidden/>
               </w:rPr>
               <w:fldChar w:fldCharType="end"/>
@@ -992,52 +1160,65 @@
             </w:tabs>
             <w:rPr>
               <w:rFonts w:eastAsiaTheme="minorEastAsia" w:cstheme="minorBidi"/>
+              <w:noProof/>
               <w:kern w:val="2"/>
               <w:sz w:val="24"/>
               <w:szCs w:val="24"/>
               <w14:ligatures w14:val="standardContextual"/>
             </w:rPr>
           </w:pPr>
-          <w:hyperlink w:anchor="_Toc238499614">
-            <w:r>
-              <w:rPr>
-                <w:rStyle w:val="IndexLink"/>
-                <w:webHidden/>
+          <w:hyperlink w:anchor="_Toc238547683" w:history="1">
+            <w:r>
+              <w:rPr>
+                <w:rStyle w:val="Collegamentoipertestuale"/>
+                <w:noProof/>
               </w:rPr>
               <w:t>D5. Ethical &amp; Responsible AI</w:t>
             </w:r>
             <w:r>
               <w:rPr>
+                <w:noProof/>
+                <w:webHidden/>
+              </w:rPr>
+              <w:tab/>
+            </w:r>
+            <w:r>
+              <w:rPr>
+                <w:noProof/>
                 <w:webHidden/>
               </w:rPr>
               <w:fldChar w:fldCharType="begin"/>
             </w:r>
             <w:r>
               <w:rPr>
-                <w:webHidden/>
-              </w:rPr>
-              <w:instrText>PAGEREF _Toc238499614 \h</w:instrText>
-            </w:r>
-            <w:r>
-              <w:rPr>
-                <w:webHidden/>
-              </w:rPr>
-            </w:r>
-            <w:r>
-              <w:rPr>
+                <w:noProof/>
+                <w:webHidden/>
+              </w:rPr>
+              <w:instrText xml:space="preserve"> PAGEREF _Toc238547683 \h </w:instrText>
+            </w:r>
+            <w:r>
+              <w:rPr>
+                <w:noProof/>
+                <w:webHidden/>
+              </w:rPr>
+            </w:r>
+            <w:r>
+              <w:rPr>
+                <w:noProof/>
                 <w:webHidden/>
               </w:rPr>
               <w:fldChar w:fldCharType="separate"/>
             </w:r>
             <w:r>
               <w:rPr>
-                <w:rStyle w:val="IndexLink"/>
-              </w:rPr>
-              <w:tab/>
-              <w:t>13</w:t>
-            </w:r>
-            <w:r>
-              <w:rPr>
+                <w:noProof/>
+                <w:webHidden/>
+              </w:rPr>
+              <w:t>12</w:t>
+            </w:r>
+            <w:r>
+              <w:rPr>
+                <w:noProof/>
                 <w:webHidden/>
               </w:rPr>
               <w:fldChar w:fldCharType="end"/>
@@ -1052,52 +1233,65 @@
             </w:tabs>
             <w:rPr>
               <w:rFonts w:eastAsiaTheme="minorEastAsia" w:cstheme="minorBidi"/>
+              <w:noProof/>
               <w:kern w:val="2"/>
               <w:sz w:val="24"/>
               <w:szCs w:val="24"/>
               <w14:ligatures w14:val="standardContextual"/>
             </w:rPr>
           </w:pPr>
-          <w:hyperlink w:anchor="_Toc238499615">
-            <w:r>
-              <w:rPr>
-                <w:rStyle w:val="IndexLink"/>
-                <w:webHidden/>
+          <w:hyperlink w:anchor="_Toc238547684" w:history="1">
+            <w:r>
+              <w:rPr>
+                <w:rStyle w:val="Collegamentoipertestuale"/>
+                <w:noProof/>
               </w:rPr>
               <w:t>D6. Operational Readiness &amp; Lifecycle Management</w:t>
             </w:r>
             <w:r>
               <w:rPr>
+                <w:noProof/>
+                <w:webHidden/>
+              </w:rPr>
+              <w:tab/>
+            </w:r>
+            <w:r>
+              <w:rPr>
+                <w:noProof/>
                 <w:webHidden/>
               </w:rPr>
               <w:fldChar w:fldCharType="begin"/>
             </w:r>
             <w:r>
               <w:rPr>
-                <w:webHidden/>
-              </w:rPr>
-              <w:instrText>PAGEREF _Toc238499615 \h</w:instrText>
-            </w:r>
-            <w:r>
-              <w:rPr>
-                <w:webHidden/>
-              </w:rPr>
-            </w:r>
-            <w:r>
-              <w:rPr>
+                <w:noProof/>
+                <w:webHidden/>
+              </w:rPr>
+              <w:instrText xml:space="preserve"> PAGEREF _Toc238547684 \h </w:instrText>
+            </w:r>
+            <w:r>
+              <w:rPr>
+                <w:noProof/>
+                <w:webHidden/>
+              </w:rPr>
+            </w:r>
+            <w:r>
+              <w:rPr>
+                <w:noProof/>
                 <w:webHidden/>
               </w:rPr>
               <w:fldChar w:fldCharType="separate"/>
             </w:r>
             <w:r>
               <w:rPr>
-                <w:rStyle w:val="IndexLink"/>
-              </w:rPr>
-              <w:tab/>
-              <w:t>14</w:t>
-            </w:r>
-            <w:r>
-              <w:rPr>
+                <w:noProof/>
+                <w:webHidden/>
+              </w:rPr>
+              <w:t>13</w:t>
+            </w:r>
+            <w:r>
+              <w:rPr>
+                <w:noProof/>
                 <w:webHidden/>
               </w:rPr>
               <w:fldChar w:fldCharType="end"/>
@@ -1112,52 +1306,65 @@
             </w:tabs>
             <w:rPr>
               <w:rFonts w:eastAsiaTheme="minorEastAsia" w:cstheme="minorBidi"/>
+              <w:noProof/>
               <w:kern w:val="2"/>
               <w:sz w:val="24"/>
               <w:szCs w:val="24"/>
               <w14:ligatures w14:val="standardContextual"/>
             </w:rPr>
           </w:pPr>
-          <w:hyperlink w:anchor="_Toc238499616">
-            <w:r>
-              <w:rPr>
-                <w:rStyle w:val="IndexLink"/>
-                <w:webHidden/>
+          <w:hyperlink w:anchor="_Toc238547685" w:history="1">
+            <w:r>
+              <w:rPr>
+                <w:rStyle w:val="Collegamentoipertestuale"/>
+                <w:noProof/>
               </w:rPr>
               <w:t>5. Scala di Scoring</w:t>
             </w:r>
             <w:r>
               <w:rPr>
+                <w:noProof/>
+                <w:webHidden/>
+              </w:rPr>
+              <w:tab/>
+            </w:r>
+            <w:r>
+              <w:rPr>
+                <w:noProof/>
                 <w:webHidden/>
               </w:rPr>
               <w:fldChar w:fldCharType="begin"/>
             </w:r>
             <w:r>
               <w:rPr>
-                <w:webHidden/>
-              </w:rPr>
-              <w:instrText>PAGEREF _Toc238499616 \h</w:instrText>
-            </w:r>
-            <w:r>
-              <w:rPr>
-                <w:webHidden/>
-              </w:rPr>
-            </w:r>
-            <w:r>
-              <w:rPr>
+                <w:noProof/>
+                <w:webHidden/>
+              </w:rPr>
+              <w:instrText xml:space="preserve"> PAGEREF _Toc238547685 \h </w:instrText>
+            </w:r>
+            <w:r>
+              <w:rPr>
+                <w:noProof/>
+                <w:webHidden/>
+              </w:rPr>
+            </w:r>
+            <w:r>
+              <w:rPr>
+                <w:noProof/>
                 <w:webHidden/>
               </w:rPr>
               <w:fldChar w:fldCharType="separate"/>
             </w:r>
             <w:r>
               <w:rPr>
-                <w:rStyle w:val="IndexLink"/>
-              </w:rPr>
-              <w:tab/>
-              <w:t>15</w:t>
-            </w:r>
-            <w:r>
-              <w:rPr>
+                <w:noProof/>
+                <w:webHidden/>
+              </w:rPr>
+              <w:t>14</w:t>
+            </w:r>
+            <w:r>
+              <w:rPr>
+                <w:noProof/>
                 <w:webHidden/>
               </w:rPr>
               <w:fldChar w:fldCharType="end"/>
@@ -1172,52 +1379,65 @@
             </w:tabs>
             <w:rPr>
               <w:rFonts w:eastAsiaTheme="minorEastAsia" w:cstheme="minorBidi"/>
+              <w:noProof/>
               <w:kern w:val="2"/>
               <w:sz w:val="24"/>
               <w:szCs w:val="24"/>
               <w14:ligatures w14:val="standardContextual"/>
             </w:rPr>
           </w:pPr>
-          <w:hyperlink w:anchor="_Toc238499617">
-            <w:r>
-              <w:rPr>
-                <w:rStyle w:val="IndexLink"/>
-                <w:webHidden/>
+          <w:hyperlink w:anchor="_Toc238547686" w:history="1">
+            <w:r>
+              <w:rPr>
+                <w:rStyle w:val="Collegamentoipertestuale"/>
+                <w:noProof/>
               </w:rPr>
               <w:t>6. Gate di Approvazione</w:t>
             </w:r>
             <w:r>
               <w:rPr>
+                <w:noProof/>
+                <w:webHidden/>
+              </w:rPr>
+              <w:tab/>
+            </w:r>
+            <w:r>
+              <w:rPr>
+                <w:noProof/>
                 <w:webHidden/>
               </w:rPr>
               <w:fldChar w:fldCharType="begin"/>
             </w:r>
             <w:r>
               <w:rPr>
-                <w:webHidden/>
-              </w:rPr>
-              <w:instrText>PAGEREF _Toc238499617 \h</w:instrText>
-            </w:r>
-            <w:r>
-              <w:rPr>
-                <w:webHidden/>
-              </w:rPr>
-            </w:r>
-            <w:r>
-              <w:rPr>
+                <w:noProof/>
+                <w:webHidden/>
+              </w:rPr>
+              <w:instrText xml:space="preserve"> PAGEREF _Toc238547686 \h </w:instrText>
+            </w:r>
+            <w:r>
+              <w:rPr>
+                <w:noProof/>
+                <w:webHidden/>
+              </w:rPr>
+            </w:r>
+            <w:r>
+              <w:rPr>
+                <w:noProof/>
                 <w:webHidden/>
               </w:rPr>
               <w:fldChar w:fldCharType="separate"/>
             </w:r>
             <w:r>
               <w:rPr>
-                <w:rStyle w:val="IndexLink"/>
-              </w:rPr>
-              <w:tab/>
-              <w:t>16</w:t>
-            </w:r>
-            <w:r>
-              <w:rPr>
+                <w:noProof/>
+                <w:webHidden/>
+              </w:rPr>
+              <w:t>15</w:t>
+            </w:r>
+            <w:r>
+              <w:rPr>
+                <w:noProof/>
                 <w:webHidden/>
               </w:rPr>
               <w:fldChar w:fldCharType="end"/>
@@ -1232,52 +1452,65 @@
             </w:tabs>
             <w:rPr>
               <w:rFonts w:eastAsiaTheme="minorEastAsia" w:cstheme="minorBidi"/>
+              <w:noProof/>
               <w:kern w:val="2"/>
               <w:sz w:val="24"/>
               <w:szCs w:val="24"/>
               <w14:ligatures w14:val="standardContextual"/>
             </w:rPr>
           </w:pPr>
-          <w:hyperlink w:anchor="_Toc238499618">
-            <w:r>
-              <w:rPr>
-                <w:rStyle w:val="IndexLink"/>
-                <w:webHidden/>
+          <w:hyperlink w:anchor="_Toc238547687" w:history="1">
+            <w:r>
+              <w:rPr>
+                <w:rStyle w:val="Collegamentoipertestuale"/>
+                <w:noProof/>
               </w:rPr>
               <w:t>7. Processo di Valutazione</w:t>
             </w:r>
             <w:r>
               <w:rPr>
+                <w:noProof/>
+                <w:webHidden/>
+              </w:rPr>
+              <w:tab/>
+            </w:r>
+            <w:r>
+              <w:rPr>
+                <w:noProof/>
                 <w:webHidden/>
               </w:rPr>
               <w:fldChar w:fldCharType="begin"/>
             </w:r>
             <w:r>
               <w:rPr>
-                <w:webHidden/>
-              </w:rPr>
-              <w:instrText>PAGEREF _Toc238499618 \h</w:instrText>
-            </w:r>
-            <w:r>
-              <w:rPr>
-                <w:webHidden/>
-              </w:rPr>
-            </w:r>
-            <w:r>
-              <w:rPr>
+                <w:noProof/>
+                <w:webHidden/>
+              </w:rPr>
+              <w:instrText xml:space="preserve"> PAGEREF _Toc238547687 \h </w:instrText>
+            </w:r>
+            <w:r>
+              <w:rPr>
+                <w:noProof/>
+                <w:webHidden/>
+              </w:rPr>
+            </w:r>
+            <w:r>
+              <w:rPr>
+                <w:noProof/>
                 <w:webHidden/>
               </w:rPr>
               <w:fldChar w:fldCharType="separate"/>
             </w:r>
             <w:r>
               <w:rPr>
-                <w:rStyle w:val="IndexLink"/>
-              </w:rPr>
-              <w:tab/>
-              <w:t>17</w:t>
-            </w:r>
-            <w:r>
-              <w:rPr>
+                <w:noProof/>
+                <w:webHidden/>
+              </w:rPr>
+              <w:t>16</w:t>
+            </w:r>
+            <w:r>
+              <w:rPr>
+                <w:noProof/>
                 <w:webHidden/>
               </w:rPr>
               <w:fldChar w:fldCharType="end"/>
@@ -1292,52 +1525,65 @@
             </w:tabs>
             <w:rPr>
               <w:rFonts w:eastAsiaTheme="minorEastAsia" w:cstheme="minorBidi"/>
+              <w:noProof/>
               <w:kern w:val="2"/>
               <w:sz w:val="24"/>
               <w:szCs w:val="24"/>
               <w14:ligatures w14:val="standardContextual"/>
             </w:rPr>
           </w:pPr>
-          <w:hyperlink w:anchor="_Toc238499619">
-            <w:r>
-              <w:rPr>
-                <w:rStyle w:val="IndexLink"/>
-                <w:webHidden/>
+          <w:hyperlink w:anchor="_Toc238547688" w:history="1">
+            <w:r>
+              <w:rPr>
+                <w:rStyle w:val="Collegamentoipertestuale"/>
+                <w:noProof/>
               </w:rPr>
               <w:t>8. Personalizzazione per Settore</w:t>
             </w:r>
             <w:r>
               <w:rPr>
+                <w:noProof/>
+                <w:webHidden/>
+              </w:rPr>
+              <w:tab/>
+            </w:r>
+            <w:r>
+              <w:rPr>
+                <w:noProof/>
                 <w:webHidden/>
               </w:rPr>
               <w:fldChar w:fldCharType="begin"/>
             </w:r>
             <w:r>
               <w:rPr>
-                <w:webHidden/>
-              </w:rPr>
-              <w:instrText>PAGEREF _Toc238499619 \h</w:instrText>
-            </w:r>
-            <w:r>
-              <w:rPr>
-                <w:webHidden/>
-              </w:rPr>
-            </w:r>
-            <w:r>
-              <w:rPr>
+                <w:noProof/>
+                <w:webHidden/>
+              </w:rPr>
+              <w:instrText xml:space="preserve"> PAGEREF _Toc238547688 \h </w:instrText>
+            </w:r>
+            <w:r>
+              <w:rPr>
+                <w:noProof/>
+                <w:webHidden/>
+              </w:rPr>
+            </w:r>
+            <w:r>
+              <w:rPr>
+                <w:noProof/>
                 <w:webHidden/>
               </w:rPr>
               <w:fldChar w:fldCharType="separate"/>
             </w:r>
             <w:r>
               <w:rPr>
-                <w:rStyle w:val="IndexLink"/>
-              </w:rPr>
-              <w:tab/>
-              <w:t>18</w:t>
-            </w:r>
-            <w:r>
-              <w:rPr>
+                <w:noProof/>
+                <w:webHidden/>
+              </w:rPr>
+              <w:t>17</w:t>
+            </w:r>
+            <w:r>
+              <w:rPr>
+                <w:noProof/>
                 <w:webHidden/>
               </w:rPr>
               <w:fldChar w:fldCharType="end"/>
@@ -1352,52 +1598,65 @@
             </w:tabs>
             <w:rPr>
               <w:rFonts w:eastAsiaTheme="minorEastAsia" w:cstheme="minorBidi"/>
+              <w:noProof/>
               <w:kern w:val="2"/>
               <w:sz w:val="24"/>
               <w:szCs w:val="24"/>
               <w14:ligatures w14:val="standardContextual"/>
             </w:rPr>
           </w:pPr>
-          <w:hyperlink w:anchor="_Toc238499620">
-            <w:r>
-              <w:rPr>
-                <w:rStyle w:val="IndexLink"/>
-                <w:webHidden/>
+          <w:hyperlink w:anchor="_Toc238547689" w:history="1">
+            <w:r>
+              <w:rPr>
+                <w:rStyle w:val="Collegamentoipertestuale"/>
+                <w:noProof/>
               </w:rPr>
               <w:t>9. Referenze Dettagliate per Criterio di Valutazione</w:t>
             </w:r>
             <w:r>
               <w:rPr>
+                <w:noProof/>
+                <w:webHidden/>
+              </w:rPr>
+              <w:tab/>
+            </w:r>
+            <w:r>
+              <w:rPr>
+                <w:noProof/>
                 <w:webHidden/>
               </w:rPr>
               <w:fldChar w:fldCharType="begin"/>
             </w:r>
             <w:r>
               <w:rPr>
-                <w:webHidden/>
-              </w:rPr>
-              <w:instrText>PAGEREF _Toc238499620 \h</w:instrText>
-            </w:r>
-            <w:r>
-              <w:rPr>
-                <w:webHidden/>
-              </w:rPr>
-            </w:r>
-            <w:r>
-              <w:rPr>
+                <w:noProof/>
+                <w:webHidden/>
+              </w:rPr>
+              <w:instrText xml:space="preserve"> PAGEREF _Toc238547689 \h </w:instrText>
+            </w:r>
+            <w:r>
+              <w:rPr>
+                <w:noProof/>
+                <w:webHidden/>
+              </w:rPr>
+            </w:r>
+            <w:r>
+              <w:rPr>
+                <w:noProof/>
                 <w:webHidden/>
               </w:rPr>
               <w:fldChar w:fldCharType="separate"/>
             </w:r>
             <w:r>
               <w:rPr>
-                <w:rStyle w:val="IndexLink"/>
-              </w:rPr>
-              <w:tab/>
-              <w:t>19</w:t>
-            </w:r>
-            <w:r>
-              <w:rPr>
+                <w:noProof/>
+                <w:webHidden/>
+              </w:rPr>
+              <w:t>18</w:t>
+            </w:r>
+            <w:r>
+              <w:rPr>
+                <w:noProof/>
                 <w:webHidden/>
               </w:rPr>
               <w:fldChar w:fldCharType="end"/>
@@ -1412,52 +1671,65 @@
             </w:tabs>
             <w:rPr>
               <w:rFonts w:eastAsiaTheme="minorEastAsia" w:cstheme="minorBidi"/>
+              <w:noProof/>
               <w:kern w:val="2"/>
               <w:sz w:val="24"/>
               <w:szCs w:val="24"/>
               <w14:ligatures w14:val="standardContextual"/>
             </w:rPr>
           </w:pPr>
-          <w:hyperlink w:anchor="_Toc238499621">
-            <w:r>
-              <w:rPr>
-                <w:rStyle w:val="IndexLink"/>
-                <w:webHidden/>
+          <w:hyperlink w:anchor="_Toc238547690" w:history="1">
+            <w:r>
+              <w:rPr>
+                <w:rStyle w:val="Collegamentoipertestuale"/>
+                <w:noProof/>
               </w:rPr>
               <w:t>D1. Strategic Alignment &amp; Business Value</w:t>
             </w:r>
             <w:r>
               <w:rPr>
+                <w:noProof/>
+                <w:webHidden/>
+              </w:rPr>
+              <w:tab/>
+            </w:r>
+            <w:r>
+              <w:rPr>
+                <w:noProof/>
                 <w:webHidden/>
               </w:rPr>
               <w:fldChar w:fldCharType="begin"/>
             </w:r>
             <w:r>
               <w:rPr>
-                <w:webHidden/>
-              </w:rPr>
-              <w:instrText>PAGEREF _Toc238499621 \h</w:instrText>
-            </w:r>
-            <w:r>
-              <w:rPr>
-                <w:webHidden/>
-              </w:rPr>
-            </w:r>
-            <w:r>
-              <w:rPr>
+                <w:noProof/>
+                <w:webHidden/>
+              </w:rPr>
+              <w:instrText xml:space="preserve"> PAGEREF _Toc238547690 \h </w:instrText>
+            </w:r>
+            <w:r>
+              <w:rPr>
+                <w:noProof/>
+                <w:webHidden/>
+              </w:rPr>
+            </w:r>
+            <w:r>
+              <w:rPr>
+                <w:noProof/>
                 <w:webHidden/>
               </w:rPr>
               <w:fldChar w:fldCharType="separate"/>
             </w:r>
             <w:r>
               <w:rPr>
-                <w:rStyle w:val="IndexLink"/>
-              </w:rPr>
-              <w:tab/>
-              <w:t>19</w:t>
-            </w:r>
-            <w:r>
-              <w:rPr>
+                <w:noProof/>
+                <w:webHidden/>
+              </w:rPr>
+              <w:t>18</w:t>
+            </w:r>
+            <w:r>
+              <w:rPr>
+                <w:noProof/>
                 <w:webHidden/>
               </w:rPr>
               <w:fldChar w:fldCharType="end"/>
@@ -1472,52 +1744,65 @@
             </w:tabs>
             <w:rPr>
               <w:rFonts w:eastAsiaTheme="minorEastAsia" w:cstheme="minorBidi"/>
+              <w:noProof/>
               <w:kern w:val="2"/>
               <w:sz w:val="24"/>
               <w:szCs w:val="24"/>
               <w14:ligatures w14:val="standardContextual"/>
             </w:rPr>
           </w:pPr>
-          <w:hyperlink w:anchor="_Toc238499622">
-            <w:r>
-              <w:rPr>
-                <w:rStyle w:val="IndexLink"/>
-                <w:webHidden/>
+          <w:hyperlink w:anchor="_Toc238547691" w:history="1">
+            <w:r>
+              <w:rPr>
+                <w:rStyle w:val="Collegamentoipertestuale"/>
+                <w:noProof/>
               </w:rPr>
               <w:t>D2. Risk Classification &amp; Regulatory Compliance</w:t>
             </w:r>
             <w:r>
               <w:rPr>
+                <w:noProof/>
+                <w:webHidden/>
+              </w:rPr>
+              <w:tab/>
+            </w:r>
+            <w:r>
+              <w:rPr>
+                <w:noProof/>
                 <w:webHidden/>
               </w:rPr>
               <w:fldChar w:fldCharType="begin"/>
             </w:r>
             <w:r>
               <w:rPr>
-                <w:webHidden/>
-              </w:rPr>
-              <w:instrText>PAGEREF _Toc238499622 \h</w:instrText>
-            </w:r>
-            <w:r>
-              <w:rPr>
-                <w:webHidden/>
-              </w:rPr>
-            </w:r>
-            <w:r>
-              <w:rPr>
+                <w:noProof/>
+                <w:webHidden/>
+              </w:rPr>
+              <w:instrText xml:space="preserve"> PAGEREF _Toc238547691 \h </w:instrText>
+            </w:r>
+            <w:r>
+              <w:rPr>
+                <w:noProof/>
+                <w:webHidden/>
+              </w:rPr>
+            </w:r>
+            <w:r>
+              <w:rPr>
+                <w:noProof/>
                 <w:webHidden/>
               </w:rPr>
               <w:fldChar w:fldCharType="separate"/>
             </w:r>
             <w:r>
               <w:rPr>
-                <w:rStyle w:val="IndexLink"/>
-              </w:rPr>
-              <w:tab/>
-              <w:t>19</w:t>
-            </w:r>
-            <w:r>
-              <w:rPr>
+                <w:noProof/>
+                <w:webHidden/>
+              </w:rPr>
+              <w:t>18</w:t>
+            </w:r>
+            <w:r>
+              <w:rPr>
+                <w:noProof/>
                 <w:webHidden/>
               </w:rPr>
               <w:fldChar w:fldCharType="end"/>
@@ -1532,52 +1817,65 @@
             </w:tabs>
             <w:rPr>
               <w:rFonts w:eastAsiaTheme="minorEastAsia" w:cstheme="minorBidi"/>
+              <w:noProof/>
               <w:kern w:val="2"/>
               <w:sz w:val="24"/>
               <w:szCs w:val="24"/>
               <w14:ligatures w14:val="standardContextual"/>
             </w:rPr>
           </w:pPr>
-          <w:hyperlink w:anchor="_Toc238499623">
-            <w:r>
-              <w:rPr>
-                <w:rStyle w:val="IndexLink"/>
-                <w:webHidden/>
+          <w:hyperlink w:anchor="_Toc238547692" w:history="1">
+            <w:r>
+              <w:rPr>
+                <w:rStyle w:val="Collegamentoipertestuale"/>
+                <w:noProof/>
               </w:rPr>
               <w:t>D3. Data Readiness &amp; Governance</w:t>
             </w:r>
             <w:r>
               <w:rPr>
+                <w:noProof/>
+                <w:webHidden/>
+              </w:rPr>
+              <w:tab/>
+            </w:r>
+            <w:r>
+              <w:rPr>
+                <w:noProof/>
                 <w:webHidden/>
               </w:rPr>
               <w:fldChar w:fldCharType="begin"/>
             </w:r>
             <w:r>
               <w:rPr>
-                <w:webHidden/>
-              </w:rPr>
-              <w:instrText>PAGEREF _Toc238499623 \h</w:instrText>
-            </w:r>
-            <w:r>
-              <w:rPr>
-                <w:webHidden/>
-              </w:rPr>
-            </w:r>
-            <w:r>
-              <w:rPr>
+                <w:noProof/>
+                <w:webHidden/>
+              </w:rPr>
+              <w:instrText xml:space="preserve"> PAGEREF _Toc238547692 \h </w:instrText>
+            </w:r>
+            <w:r>
+              <w:rPr>
+                <w:noProof/>
+                <w:webHidden/>
+              </w:rPr>
+            </w:r>
+            <w:r>
+              <w:rPr>
+                <w:noProof/>
                 <w:webHidden/>
               </w:rPr>
               <w:fldChar w:fldCharType="separate"/>
             </w:r>
             <w:r>
               <w:rPr>
-                <w:rStyle w:val="IndexLink"/>
-              </w:rPr>
-              <w:tab/>
-              <w:t>19</w:t>
-            </w:r>
-            <w:r>
-              <w:rPr>
+                <w:noProof/>
+                <w:webHidden/>
+              </w:rPr>
+              <w:t>18</w:t>
+            </w:r>
+            <w:r>
+              <w:rPr>
+                <w:noProof/>
                 <w:webHidden/>
               </w:rPr>
               <w:fldChar w:fldCharType="end"/>
@@ -1592,52 +1890,65 @@
             </w:tabs>
             <w:rPr>
               <w:rFonts w:eastAsiaTheme="minorEastAsia" w:cstheme="minorBidi"/>
+              <w:noProof/>
               <w:kern w:val="2"/>
               <w:sz w:val="24"/>
               <w:szCs w:val="24"/>
               <w14:ligatures w14:val="standardContextual"/>
             </w:rPr>
           </w:pPr>
-          <w:hyperlink w:anchor="_Toc238499624">
-            <w:r>
-              <w:rPr>
-                <w:rStyle w:val="IndexLink"/>
-                <w:webHidden/>
+          <w:hyperlink w:anchor="_Toc238547693" w:history="1">
+            <w:r>
+              <w:rPr>
+                <w:rStyle w:val="Collegamentoipertestuale"/>
+                <w:noProof/>
               </w:rPr>
               <w:t>D4. Technical Feasibility &amp; Architecture</w:t>
             </w:r>
             <w:r>
               <w:rPr>
+                <w:noProof/>
+                <w:webHidden/>
+              </w:rPr>
+              <w:tab/>
+            </w:r>
+            <w:r>
+              <w:rPr>
+                <w:noProof/>
                 <w:webHidden/>
               </w:rPr>
               <w:fldChar w:fldCharType="begin"/>
             </w:r>
             <w:r>
               <w:rPr>
-                <w:webHidden/>
-              </w:rPr>
-              <w:instrText>PAGEREF _Toc238499624 \h</w:instrText>
-            </w:r>
-            <w:r>
-              <w:rPr>
-                <w:webHidden/>
-              </w:rPr>
-            </w:r>
-            <w:r>
-              <w:rPr>
+                <w:noProof/>
+                <w:webHidden/>
+              </w:rPr>
+              <w:instrText xml:space="preserve"> PAGEREF _Toc238547693 \h </w:instrText>
+            </w:r>
+            <w:r>
+              <w:rPr>
+                <w:noProof/>
+                <w:webHidden/>
+              </w:rPr>
+            </w:r>
+            <w:r>
+              <w:rPr>
+                <w:noProof/>
                 <w:webHidden/>
               </w:rPr>
               <w:fldChar w:fldCharType="separate"/>
             </w:r>
             <w:r>
               <w:rPr>
-                <w:rStyle w:val="IndexLink"/>
-              </w:rPr>
-              <w:tab/>
-              <w:t>19</w:t>
-            </w:r>
-            <w:r>
-              <w:rPr>
+                <w:noProof/>
+                <w:webHidden/>
+              </w:rPr>
+              <w:t>18</w:t>
+            </w:r>
+            <w:r>
+              <w:rPr>
+                <w:noProof/>
                 <w:webHidden/>
               </w:rPr>
               <w:fldChar w:fldCharType="end"/>
@@ -1652,52 +1963,65 @@
             </w:tabs>
             <w:rPr>
               <w:rFonts w:eastAsiaTheme="minorEastAsia" w:cstheme="minorBidi"/>
+              <w:noProof/>
               <w:kern w:val="2"/>
               <w:sz w:val="24"/>
               <w:szCs w:val="24"/>
               <w14:ligatures w14:val="standardContextual"/>
             </w:rPr>
           </w:pPr>
-          <w:hyperlink w:anchor="_Toc238499625">
-            <w:r>
-              <w:rPr>
-                <w:rStyle w:val="IndexLink"/>
-                <w:webHidden/>
+          <w:hyperlink w:anchor="_Toc238547694" w:history="1">
+            <w:r>
+              <w:rPr>
+                <w:rStyle w:val="Collegamentoipertestuale"/>
+                <w:noProof/>
               </w:rPr>
               <w:t>D5. Ethical &amp; Responsible AI</w:t>
             </w:r>
             <w:r>
               <w:rPr>
+                <w:noProof/>
+                <w:webHidden/>
+              </w:rPr>
+              <w:tab/>
+            </w:r>
+            <w:r>
+              <w:rPr>
+                <w:noProof/>
                 <w:webHidden/>
               </w:rPr>
               <w:fldChar w:fldCharType="begin"/>
             </w:r>
             <w:r>
               <w:rPr>
-                <w:webHidden/>
-              </w:rPr>
-              <w:instrText>PAGEREF _Toc238499625 \h</w:instrText>
-            </w:r>
-            <w:r>
-              <w:rPr>
-                <w:webHidden/>
-              </w:rPr>
-            </w:r>
-            <w:r>
-              <w:rPr>
+                <w:noProof/>
+                <w:webHidden/>
+              </w:rPr>
+              <w:instrText xml:space="preserve"> PAGEREF _Toc238547694 \h </w:instrText>
+            </w:r>
+            <w:r>
+              <w:rPr>
+                <w:noProof/>
+                <w:webHidden/>
+              </w:rPr>
+            </w:r>
+            <w:r>
+              <w:rPr>
+                <w:noProof/>
                 <w:webHidden/>
               </w:rPr>
               <w:fldChar w:fldCharType="separate"/>
             </w:r>
             <w:r>
               <w:rPr>
-                <w:rStyle w:val="IndexLink"/>
-              </w:rPr>
-              <w:tab/>
-              <w:t>19</w:t>
-            </w:r>
-            <w:r>
-              <w:rPr>
+                <w:noProof/>
+                <w:webHidden/>
+              </w:rPr>
+              <w:t>18</w:t>
+            </w:r>
+            <w:r>
+              <w:rPr>
+                <w:noProof/>
                 <w:webHidden/>
               </w:rPr>
               <w:fldChar w:fldCharType="end"/>
@@ -1712,52 +2036,65 @@
             </w:tabs>
             <w:rPr>
               <w:rFonts w:eastAsiaTheme="minorEastAsia" w:cstheme="minorBidi"/>
+              <w:noProof/>
               <w:kern w:val="2"/>
               <w:sz w:val="24"/>
               <w:szCs w:val="24"/>
               <w14:ligatures w14:val="standardContextual"/>
             </w:rPr>
           </w:pPr>
-          <w:hyperlink w:anchor="_Toc238499626">
-            <w:r>
-              <w:rPr>
-                <w:rStyle w:val="IndexLink"/>
-                <w:webHidden/>
+          <w:hyperlink w:anchor="_Toc238547695" w:history="1">
+            <w:r>
+              <w:rPr>
+                <w:rStyle w:val="Collegamentoipertestuale"/>
+                <w:noProof/>
               </w:rPr>
               <w:t>D6. Operational Readiness &amp; Lifecycle Management</w:t>
             </w:r>
             <w:r>
               <w:rPr>
+                <w:noProof/>
+                <w:webHidden/>
+              </w:rPr>
+              <w:tab/>
+            </w:r>
+            <w:r>
+              <w:rPr>
+                <w:noProof/>
                 <w:webHidden/>
               </w:rPr>
               <w:fldChar w:fldCharType="begin"/>
             </w:r>
             <w:r>
               <w:rPr>
-                <w:webHidden/>
-              </w:rPr>
-              <w:instrText>PAGEREF _Toc238499626 \h</w:instrText>
-            </w:r>
-            <w:r>
-              <w:rPr>
-                <w:webHidden/>
-              </w:rPr>
-            </w:r>
-            <w:r>
-              <w:rPr>
+                <w:noProof/>
+                <w:webHidden/>
+              </w:rPr>
+              <w:instrText xml:space="preserve"> PAGEREF _Toc238547695 \h </w:instrText>
+            </w:r>
+            <w:r>
+              <w:rPr>
+                <w:noProof/>
+                <w:webHidden/>
+              </w:rPr>
+            </w:r>
+            <w:r>
+              <w:rPr>
+                <w:noProof/>
                 <w:webHidden/>
               </w:rPr>
               <w:fldChar w:fldCharType="separate"/>
             </w:r>
             <w:r>
               <w:rPr>
-                <w:rStyle w:val="IndexLink"/>
-              </w:rPr>
-              <w:tab/>
-              <w:t>20</w:t>
-            </w:r>
-            <w:r>
-              <w:rPr>
+                <w:noProof/>
+                <w:webHidden/>
+              </w:rPr>
+              <w:t>19</w:t>
+            </w:r>
+            <w:r>
+              <w:rPr>
+                <w:noProof/>
                 <w:webHidden/>
               </w:rPr>
               <w:fldChar w:fldCharType="end"/>
@@ -1781,7 +2118,7 @@
         <w:pStyle w:val="Titolo1"/>
         <w:spacing w:before="0"/>
       </w:pPr>
-      <w:bookmarkStart w:id="1" w:name="_Toc238499603"/>
+      <w:bookmarkStart w:id="1" w:name="_Toc238547672"/>
       <w:r>
         <w:lastRenderedPageBreak/>
         <w:t xml:space="preserve">1. Executive </w:t>
@@ -2018,7 +2355,7 @@
         <w:pStyle w:val="Titolo1"/>
         <w:spacing w:before="0"/>
       </w:pPr>
-      <w:bookmarkStart w:id="2" w:name="_Toc238499604"/>
+      <w:bookmarkStart w:id="2" w:name="_Toc238547673"/>
       <w:r>
         <w:lastRenderedPageBreak/>
         <w:t>2. Contesto e Motivazione</w:t>
@@ -3180,7 +3517,7 @@
       <w:pPr>
         <w:pStyle w:val="Titolo2"/>
       </w:pPr>
-      <w:bookmarkStart w:id="3" w:name="_Toc238499605"/>
+      <w:bookmarkStart w:id="3" w:name="_Toc238547674"/>
       <w:r>
         <w:t>2.1 Framework di Riferimento</w:t>
       </w:r>
@@ -3918,7 +4255,7 @@
       <w:pPr>
         <w:pStyle w:val="Titolo2"/>
       </w:pPr>
-      <w:bookmarkStart w:id="4" w:name="_Toc238499606"/>
+      <w:bookmarkStart w:id="4" w:name="_Toc238547675"/>
       <w:r>
         <w:t>2.2 Lezioni dai fallimenti: perché serve AIPAF</w:t>
       </w:r>
@@ -4576,7 +4913,7 @@
         <w:pStyle w:val="Titolo1"/>
         <w:spacing w:before="0"/>
       </w:pPr>
-      <w:bookmarkStart w:id="5" w:name="_Toc238499607"/>
+      <w:bookmarkStart w:id="5" w:name="_Toc238547676"/>
       <w:r>
         <w:lastRenderedPageBreak/>
         <w:t>3. Struttura del Framework</w:t>
@@ -5446,7 +5783,7 @@
         <w:pStyle w:val="Titolo1"/>
         <w:spacing w:before="0"/>
       </w:pPr>
-      <w:bookmarkStart w:id="6" w:name="_Toc238499608"/>
+      <w:bookmarkStart w:id="6" w:name="_Toc238547677"/>
       <w:r>
         <w:lastRenderedPageBreak/>
         <w:t>4. Dettaglio delle Dimensioni</w:t>
@@ -5457,7 +5794,7 @@
       <w:pPr>
         <w:pStyle w:val="Titolo2"/>
       </w:pPr>
-      <w:bookmarkStart w:id="7" w:name="_Toc238499609"/>
+      <w:bookmarkStart w:id="7" w:name="_Toc238547678"/>
       <w:r>
         <w:t>Nota sulla governance trasversale</w:t>
       </w:r>
@@ -5640,7 +5977,7 @@
       <w:pPr>
         <w:pStyle w:val="Titolo2"/>
       </w:pPr>
-      <w:bookmarkStart w:id="8" w:name="_Toc238499610"/>
+      <w:bookmarkStart w:id="8" w:name="_Toc238547679"/>
       <w:r>
         <w:t xml:space="preserve">D1. Strategic </w:t>
       </w:r>
@@ -6318,7 +6655,7 @@
       <w:pPr>
         <w:pStyle w:val="Titolo2"/>
       </w:pPr>
-      <w:bookmarkStart w:id="9" w:name="_Toc238499611"/>
+      <w:bookmarkStart w:id="9" w:name="_Toc238547680"/>
       <w:r>
         <w:t xml:space="preserve">D2. Risk </w:t>
       </w:r>
@@ -7039,7 +7376,7 @@
       <w:pPr>
         <w:pStyle w:val="Titolo2"/>
       </w:pPr>
-      <w:bookmarkStart w:id="10" w:name="_Toc238499612"/>
+      <w:bookmarkStart w:id="10" w:name="_Toc238547681"/>
       <w:r>
         <w:t>D3. Data Readiness &amp; Governance</w:t>
       </w:r>
@@ -7723,7 +8060,7 @@
       <w:pPr>
         <w:pStyle w:val="Titolo2"/>
       </w:pPr>
-      <w:bookmarkStart w:id="11" w:name="_Toc238499613"/>
+      <w:bookmarkStart w:id="11" w:name="_Toc238547682"/>
       <w:r>
         <w:t xml:space="preserve">D4. Technical </w:t>
       </w:r>
@@ -8504,7 +8841,7 @@
       <w:pPr>
         <w:pStyle w:val="Titolo2"/>
       </w:pPr>
-      <w:bookmarkStart w:id="12" w:name="_Toc238499614"/>
+      <w:bookmarkStart w:id="12" w:name="_Toc238547683"/>
       <w:r>
         <w:t xml:space="preserve">D5. </w:t>
       </w:r>
@@ -9383,7 +9720,7 @@
       <w:pPr>
         <w:pStyle w:val="Titolo2"/>
       </w:pPr>
-      <w:bookmarkStart w:id="13" w:name="_Toc238499615"/>
+      <w:bookmarkStart w:id="13" w:name="_Toc238547684"/>
       <w:r>
         <w:t xml:space="preserve">D6. </w:t>
       </w:r>
@@ -10232,7 +10569,7 @@
         <w:pStyle w:val="Titolo1"/>
         <w:spacing w:before="0"/>
       </w:pPr>
-      <w:bookmarkStart w:id="14" w:name="_Toc238499616"/>
+      <w:bookmarkStart w:id="14" w:name="_Toc238547685"/>
       <w:r>
         <w:lastRenderedPageBreak/>
         <w:t>5. Scala di Scoring</w:t>
@@ -10681,7 +11018,7 @@
         <w:pStyle w:val="Titolo1"/>
         <w:spacing w:before="0"/>
       </w:pPr>
-      <w:bookmarkStart w:id="15" w:name="_Toc238499617"/>
+      <w:bookmarkStart w:id="15" w:name="_Toc238547686"/>
       <w:r>
         <w:lastRenderedPageBreak/>
         <w:t>6. Gate di Approvazione</w:t>
@@ -11171,7 +11508,7 @@
         <w:pStyle w:val="Titolo1"/>
         <w:spacing w:before="0"/>
       </w:pPr>
-      <w:bookmarkStart w:id="16" w:name="_Toc238499618"/>
+      <w:bookmarkStart w:id="16" w:name="_Toc238547687"/>
       <w:r>
         <w:lastRenderedPageBreak/>
         <w:t>7. Processo di Valutazione</w:t>
@@ -11369,7 +11706,7 @@
         <w:pStyle w:val="Titolo1"/>
         <w:spacing w:before="0"/>
       </w:pPr>
-      <w:bookmarkStart w:id="17" w:name="_Toc238499619"/>
+      <w:bookmarkStart w:id="17" w:name="_Toc238547688"/>
       <w:r>
         <w:lastRenderedPageBreak/>
         <w:t>8. Personalizzazione per Settore</w:t>
@@ -12526,7 +12863,7 @@
         <w:pStyle w:val="Titolo1"/>
         <w:spacing w:before="0"/>
       </w:pPr>
-      <w:bookmarkStart w:id="18" w:name="_Toc238499620"/>
+      <w:bookmarkStart w:id="18" w:name="_Toc238547689"/>
       <w:r>
         <w:lastRenderedPageBreak/>
         <w:t>9. Referenze Dettagliate per Criterio di Valutazione</w:t>
@@ -12553,7 +12890,7 @@
       <w:pPr>
         <w:pStyle w:val="Titolo2"/>
       </w:pPr>
-      <w:bookmarkStart w:id="19" w:name="_Toc238499621"/>
+      <w:bookmarkStart w:id="19" w:name="_Toc238547690"/>
       <w:r>
         <w:t xml:space="preserve">D1. Strategic </w:t>
       </w:r>
@@ -12727,7 +13064,7 @@
       <w:pPr>
         <w:pStyle w:val="Titolo2"/>
       </w:pPr>
-      <w:bookmarkStart w:id="20" w:name="_Toc238499622"/>
+      <w:bookmarkStart w:id="20" w:name="_Toc238547691"/>
       <w:r>
         <w:t xml:space="preserve">D2. Risk </w:t>
       </w:r>
@@ -12957,7 +13294,7 @@
       <w:pPr>
         <w:pStyle w:val="Titolo2"/>
       </w:pPr>
-      <w:bookmarkStart w:id="21" w:name="_Toc238499623"/>
+      <w:bookmarkStart w:id="21" w:name="_Toc238547692"/>
       <w:r>
         <w:t>D3. Data Readiness &amp; Governance</w:t>
       </w:r>
@@ -13139,7 +13476,7 @@
       <w:pPr>
         <w:pStyle w:val="Titolo2"/>
       </w:pPr>
-      <w:bookmarkStart w:id="22" w:name="_Toc238499624"/>
+      <w:bookmarkStart w:id="22" w:name="_Toc238547693"/>
       <w:r>
         <w:t xml:space="preserve">D4. Technical </w:t>
       </w:r>
@@ -13292,7 +13629,7 @@
       <w:pPr>
         <w:pStyle w:val="Titolo2"/>
       </w:pPr>
-      <w:bookmarkStart w:id="23" w:name="_Toc238499625"/>
+      <w:bookmarkStart w:id="23" w:name="_Toc238547694"/>
       <w:r>
         <w:t xml:space="preserve">D5. </w:t>
       </w:r>
@@ -13536,7 +13873,7 @@
       <w:pPr>
         <w:pStyle w:val="Titolo2"/>
       </w:pPr>
-      <w:bookmarkStart w:id="24" w:name="_Toc238499626"/>
+      <w:bookmarkStart w:id="24" w:name="_Toc238547695"/>
       <w:r>
         <w:t xml:space="preserve">D6. </w:t>
       </w:r>
@@ -13858,7 +14195,16 @@
         <w:lang w:val="en-GB"/>
       </w:rPr>
       <w:tab/>
-      <w:t>v1.2</w:t>
+      <w:t>v1.</w:t>
+    </w:r>
+    <w:r>
+      <w:rPr>
+        <w:color w:val="7F8C8D"/>
+        <w:sz w:val="16"/>
+        <w:szCs w:val="16"/>
+        <w:lang w:val="en-GB"/>
+      </w:rPr>
+      <w:t>5</w:t>
     </w:r>
   </w:p>
 </w:hdr>

</xml_diff>